<commit_message>
added reading assignment for week 5
</commit_message>
<xml_diff>
--- a/problem_sets/Problem Set 5.docx
+++ b/problem_sets/Problem Set 5.docx
@@ -2395,19 +2395,11 @@
           <w:rFonts w:eastAsiaTheme="minorEastAsia"/>
         </w:rPr>
       </w:pPr>
-      <w:proofErr w:type="gramStart"/>
-      <w:r>
-        <w:rPr>
-          <w:rFonts w:eastAsiaTheme="minorEastAsia"/>
-        </w:rPr>
-        <w:t>compute</w:t>
-      </w:r>
-      <w:proofErr w:type="gramEnd"/>
-      <w:r>
-        <w:rPr>
-          <w:rFonts w:eastAsiaTheme="minorEastAsia"/>
-        </w:rPr>
-        <w:t xml:space="preserve"> the mapped digital pole and verify that it lies inside the unit circle</w:t>
+      <w:r>
+        <w:rPr>
+          <w:rFonts w:eastAsiaTheme="minorEastAsia"/>
+        </w:rPr>
+        <w:t>compute the mapped digital pole and verify that it lies inside the unit circle</w:t>
       </w:r>
       <w:r>
         <w:rPr>
@@ -2471,7 +2463,19 @@
         <w:rPr>
           <w:rFonts w:eastAsiaTheme="minorEastAsia"/>
         </w:rPr>
-        <w:t xml:space="preserve"> form the analog frequency </w:t>
+        <w:t xml:space="preserve"> fr</w:t>
+      </w:r>
+      <w:r>
+        <w:rPr>
+          <w:rFonts w:eastAsiaTheme="minorEastAsia"/>
+        </w:rPr>
+        <w:t>o</w:t>
+      </w:r>
+      <w:r>
+        <w:rPr>
+          <w:rFonts w:eastAsiaTheme="minorEastAsia"/>
+        </w:rPr>
+        <w:t xml:space="preserve">m the analog frequency </w:t>
       </w:r>
       <m:oMath>
         <m:r>

</xml_diff>